<commit_message>
baseline for my 2025 tanner run
</commit_message>
<xml_diff>
--- a/text/tanner/style_settings.docx
+++ b/text/tanner/style_settings.docx
@@ -1,10 +1,10 @@
 
 <file path=word/document.xml><?xml version="1.0" encoding="utf-8"?>
-<w:document xmlns:wpc="http://schemas.microsoft.com/office/word/2010/wordprocessingCanvas" xmlns:cx="http://schemas.microsoft.com/office/drawing/2014/chartex" xmlns:cx1="http://schemas.microsoft.com/office/drawing/2015/9/8/chartex" xmlns:cx2="http://schemas.microsoft.com/office/drawing/2015/10/21/chartex" xmlns:cx3="http://schemas.microsoft.com/office/drawing/2016/5/9/chartex" xmlns:cx4="http://schemas.microsoft.com/office/drawing/2016/5/10/chartex" xmlns:cx5="http://schemas.microsoft.com/office/drawing/2016/5/11/chartex" xmlns:cx6="http://schemas.microsoft.com/office/drawing/2016/5/12/chartex" xmlns:cx7="http://schemas.microsoft.com/office/drawing/2016/5/13/chartex" xmlns:cx8="http://schemas.microsoft.com/office/drawing/2016/5/14/chartex" xmlns:mc="http://schemas.openxmlformats.org/markup-compatibility/2006" xmlns:aink="http://schemas.microsoft.com/office/drawing/2016/ink" xmlns:am3d="http://schemas.microsoft.com/office/drawing/2017/model3d" xmlns:o="urn:schemas-microsoft-com:office:office" xmlns:r="http://schemas.openxmlformats.org/officeDocument/2006/relationships" xmlns:m="http://schemas.openxmlformats.org/officeDocument/2006/math" xmlns:v="urn:schemas-microsoft-com:vml" xmlns:wp14="http://schemas.microsoft.com/office/word/2010/wordprocessingDrawing" xmlns:wp="http://schemas.openxmlformats.org/drawingml/2006/wordprocessingDrawing" xmlns:w10="urn:schemas-microsoft-com:office:word" xmlns:w="http://schemas.openxmlformats.org/wordprocessingml/2006/main" xmlns:w14="http://schemas.microsoft.com/office/word/2010/wordml" xmlns:w15="http://schemas.microsoft.com/office/word/2012/wordml" xmlns:w16cex="http://schemas.microsoft.com/office/word/2018/wordml/cex" xmlns:w16cid="http://schemas.microsoft.com/office/word/2016/wordml/cid" xmlns:w16="http://schemas.microsoft.com/office/word/2018/wordml" xmlns:w16sdtdh="http://schemas.microsoft.com/office/word/2020/wordml/sdtdatahash" xmlns:w16se="http://schemas.microsoft.com/office/word/2015/wordml/symex" xmlns:wpg="http://schemas.microsoft.com/office/word/2010/wordprocessingGroup" xmlns:wpi="http://schemas.microsoft.com/office/word/2010/wordprocessingInk" xmlns:wne="http://schemas.microsoft.com/office/word/2006/wordml" xmlns:wps="http://schemas.microsoft.com/office/word/2010/wordprocessingShape" mc:Ignorable="w14 w15 w16se w16cid w16 w16cex w16sdtdh wp14">
+<w:document xmlns:wpc="http://schemas.microsoft.com/office/word/2010/wordprocessingCanvas" xmlns:cx="http://schemas.microsoft.com/office/drawing/2014/chartex" xmlns:cx1="http://schemas.microsoft.com/office/drawing/2015/9/8/chartex" xmlns:cx2="http://schemas.microsoft.com/office/drawing/2015/10/21/chartex" xmlns:cx3="http://schemas.microsoft.com/office/drawing/2016/5/9/chartex" xmlns:cx4="http://schemas.microsoft.com/office/drawing/2016/5/10/chartex" xmlns:cx5="http://schemas.microsoft.com/office/drawing/2016/5/11/chartex" xmlns:cx6="http://schemas.microsoft.com/office/drawing/2016/5/12/chartex" xmlns:cx7="http://schemas.microsoft.com/office/drawing/2016/5/13/chartex" xmlns:cx8="http://schemas.microsoft.com/office/drawing/2016/5/14/chartex" xmlns:mc="http://schemas.openxmlformats.org/markup-compatibility/2006" xmlns:aink="http://schemas.microsoft.com/office/drawing/2016/ink" xmlns:am3d="http://schemas.microsoft.com/office/drawing/2017/model3d" xmlns:o="urn:schemas-microsoft-com:office:office" xmlns:oel="http://schemas.microsoft.com/office/2019/extlst" xmlns:r="http://schemas.openxmlformats.org/officeDocument/2006/relationships" xmlns:m="http://schemas.openxmlformats.org/officeDocument/2006/math" xmlns:v="urn:schemas-microsoft-com:vml" xmlns:wp14="http://schemas.microsoft.com/office/word/2010/wordprocessingDrawing" xmlns:wp="http://schemas.openxmlformats.org/drawingml/2006/wordprocessingDrawing" xmlns:w10="urn:schemas-microsoft-com:office:word" xmlns:w="http://schemas.openxmlformats.org/wordprocessingml/2006/main" xmlns:w14="http://schemas.microsoft.com/office/word/2010/wordml" xmlns:w15="http://schemas.microsoft.com/office/word/2012/wordml" xmlns:w16cex="http://schemas.microsoft.com/office/word/2018/wordml/cex" xmlns:w16cid="http://schemas.microsoft.com/office/word/2016/wordml/cid" xmlns:w16="http://schemas.microsoft.com/office/word/2018/wordml" xmlns:w16sdtdh="http://schemas.microsoft.com/office/word/2020/wordml/sdtdatahash" xmlns:w16se="http://schemas.microsoft.com/office/word/2015/wordml/symex" xmlns:wpg="http://schemas.microsoft.com/office/word/2010/wordprocessingGroup" xmlns:wpi="http://schemas.microsoft.com/office/word/2010/wordprocessingInk" xmlns:wne="http://schemas.microsoft.com/office/word/2006/wordml" xmlns:wps="http://schemas.microsoft.com/office/word/2010/wordprocessingShape" mc:Ignorable="w14 w15 w16se w16cid w16 w16cex w16sdtdh wp14">
   <w:body>
     <w:p>
       <w:pPr>
-        <w:pStyle w:val="Title"/>
+        <w:pStyle w:val="Caption"/>
       </w:pPr>
       <w:proofErr w:type="spellStart"/>
       <w:r>
@@ -394,7 +394,7 @@
 </file>
 
 <file path=word/endnotes.xml><?xml version="1.0" encoding="utf-8"?>
-<w:endnotes xmlns:wpc="http://schemas.microsoft.com/office/word/2010/wordprocessingCanvas" xmlns:cx="http://schemas.microsoft.com/office/drawing/2014/chartex" xmlns:cx1="http://schemas.microsoft.com/office/drawing/2015/9/8/chartex" xmlns:cx2="http://schemas.microsoft.com/office/drawing/2015/10/21/chartex" xmlns:cx3="http://schemas.microsoft.com/office/drawing/2016/5/9/chartex" xmlns:cx4="http://schemas.microsoft.com/office/drawing/2016/5/10/chartex" xmlns:cx5="http://schemas.microsoft.com/office/drawing/2016/5/11/chartex" xmlns:cx6="http://schemas.microsoft.com/office/drawing/2016/5/12/chartex" xmlns:cx7="http://schemas.microsoft.com/office/drawing/2016/5/13/chartex" xmlns:cx8="http://schemas.microsoft.com/office/drawing/2016/5/14/chartex" xmlns:mc="http://schemas.openxmlformats.org/markup-compatibility/2006" xmlns:aink="http://schemas.microsoft.com/office/drawing/2016/ink" xmlns:am3d="http://schemas.microsoft.com/office/drawing/2017/model3d" xmlns:o="urn:schemas-microsoft-com:office:office" xmlns:r="http://schemas.openxmlformats.org/officeDocument/2006/relationships" xmlns:m="http://schemas.openxmlformats.org/officeDocument/2006/math" xmlns:v="urn:schemas-microsoft-com:vml" xmlns:wp14="http://schemas.microsoft.com/office/word/2010/wordprocessingDrawing" xmlns:wp="http://schemas.openxmlformats.org/drawingml/2006/wordprocessingDrawing" xmlns:w10="urn:schemas-microsoft-com:office:word" xmlns:w="http://schemas.openxmlformats.org/wordprocessingml/2006/main" xmlns:w14="http://schemas.microsoft.com/office/word/2010/wordml" xmlns:w15="http://schemas.microsoft.com/office/word/2012/wordml" xmlns:w16cex="http://schemas.microsoft.com/office/word/2018/wordml/cex" xmlns:w16cid="http://schemas.microsoft.com/office/word/2016/wordml/cid" xmlns:w16="http://schemas.microsoft.com/office/word/2018/wordml" xmlns:w16sdtdh="http://schemas.microsoft.com/office/word/2020/wordml/sdtdatahash" xmlns:w16se="http://schemas.microsoft.com/office/word/2015/wordml/symex" xmlns:wpg="http://schemas.microsoft.com/office/word/2010/wordprocessingGroup" xmlns:wpi="http://schemas.microsoft.com/office/word/2010/wordprocessingInk" xmlns:wne="http://schemas.microsoft.com/office/word/2006/wordml" xmlns:wps="http://schemas.microsoft.com/office/word/2010/wordprocessingShape" mc:Ignorable="w14 w15 w16se w16cid w16 w16cex w16sdtdh wp14">
+<w:endnotes xmlns:wpc="http://schemas.microsoft.com/office/word/2010/wordprocessingCanvas" xmlns:cx="http://schemas.microsoft.com/office/drawing/2014/chartex" xmlns:cx1="http://schemas.microsoft.com/office/drawing/2015/9/8/chartex" xmlns:cx2="http://schemas.microsoft.com/office/drawing/2015/10/21/chartex" xmlns:cx3="http://schemas.microsoft.com/office/drawing/2016/5/9/chartex" xmlns:cx4="http://schemas.microsoft.com/office/drawing/2016/5/10/chartex" xmlns:cx5="http://schemas.microsoft.com/office/drawing/2016/5/11/chartex" xmlns:cx6="http://schemas.microsoft.com/office/drawing/2016/5/12/chartex" xmlns:cx7="http://schemas.microsoft.com/office/drawing/2016/5/13/chartex" xmlns:cx8="http://schemas.microsoft.com/office/drawing/2016/5/14/chartex" xmlns:mc="http://schemas.openxmlformats.org/markup-compatibility/2006" xmlns:aink="http://schemas.microsoft.com/office/drawing/2016/ink" xmlns:am3d="http://schemas.microsoft.com/office/drawing/2017/model3d" xmlns:o="urn:schemas-microsoft-com:office:office" xmlns:oel="http://schemas.microsoft.com/office/2019/extlst" xmlns:r="http://schemas.openxmlformats.org/officeDocument/2006/relationships" xmlns:m="http://schemas.openxmlformats.org/officeDocument/2006/math" xmlns:v="urn:schemas-microsoft-com:vml" xmlns:wp14="http://schemas.microsoft.com/office/word/2010/wordprocessingDrawing" xmlns:wp="http://schemas.openxmlformats.org/drawingml/2006/wordprocessingDrawing" xmlns:w10="urn:schemas-microsoft-com:office:word" xmlns:w="http://schemas.openxmlformats.org/wordprocessingml/2006/main" xmlns:w14="http://schemas.microsoft.com/office/word/2010/wordml" xmlns:w15="http://schemas.microsoft.com/office/word/2012/wordml" xmlns:w16cex="http://schemas.microsoft.com/office/word/2018/wordml/cex" xmlns:w16cid="http://schemas.microsoft.com/office/word/2016/wordml/cid" xmlns:w16="http://schemas.microsoft.com/office/word/2018/wordml" xmlns:w16sdtdh="http://schemas.microsoft.com/office/word/2020/wordml/sdtdatahash" xmlns:w16se="http://schemas.microsoft.com/office/word/2015/wordml/symex" xmlns:wpg="http://schemas.microsoft.com/office/word/2010/wordprocessingGroup" xmlns:wpi="http://schemas.microsoft.com/office/word/2010/wordprocessingInk" xmlns:wne="http://schemas.microsoft.com/office/word/2006/wordml" xmlns:wps="http://schemas.microsoft.com/office/word/2010/wordprocessingShape" mc:Ignorable="w14 w15 w16se w16cid w16 w16cex w16sdtdh wp14">
   <w:endnote w:type="separator" w:id="-1">
     <w:p>
       <w:pPr>
@@ -419,7 +419,7 @@
 </file>
 
 <file path=word/footnotes.xml><?xml version="1.0" encoding="utf-8"?>
-<w:footnotes xmlns:wpc="http://schemas.microsoft.com/office/word/2010/wordprocessingCanvas" xmlns:cx="http://schemas.microsoft.com/office/drawing/2014/chartex" xmlns:cx1="http://schemas.microsoft.com/office/drawing/2015/9/8/chartex" xmlns:cx2="http://schemas.microsoft.com/office/drawing/2015/10/21/chartex" xmlns:cx3="http://schemas.microsoft.com/office/drawing/2016/5/9/chartex" xmlns:cx4="http://schemas.microsoft.com/office/drawing/2016/5/10/chartex" xmlns:cx5="http://schemas.microsoft.com/office/drawing/2016/5/11/chartex" xmlns:cx6="http://schemas.microsoft.com/office/drawing/2016/5/12/chartex" xmlns:cx7="http://schemas.microsoft.com/office/drawing/2016/5/13/chartex" xmlns:cx8="http://schemas.microsoft.com/office/drawing/2016/5/14/chartex" xmlns:mc="http://schemas.openxmlformats.org/markup-compatibility/2006" xmlns:aink="http://schemas.microsoft.com/office/drawing/2016/ink" xmlns:am3d="http://schemas.microsoft.com/office/drawing/2017/model3d" xmlns:o="urn:schemas-microsoft-com:office:office" xmlns:r="http://schemas.openxmlformats.org/officeDocument/2006/relationships" xmlns:m="http://schemas.openxmlformats.org/officeDocument/2006/math" xmlns:v="urn:schemas-microsoft-com:vml" xmlns:wp14="http://schemas.microsoft.com/office/word/2010/wordprocessingDrawing" xmlns:wp="http://schemas.openxmlformats.org/drawingml/2006/wordprocessingDrawing" xmlns:w10="urn:schemas-microsoft-com:office:word" xmlns:w="http://schemas.openxmlformats.org/wordprocessingml/2006/main" xmlns:w14="http://schemas.microsoft.com/office/word/2010/wordml" xmlns:w15="http://schemas.microsoft.com/office/word/2012/wordml" xmlns:w16cex="http://schemas.microsoft.com/office/word/2018/wordml/cex" xmlns:w16cid="http://schemas.microsoft.com/office/word/2016/wordml/cid" xmlns:w16="http://schemas.microsoft.com/office/word/2018/wordml" xmlns:w16sdtdh="http://schemas.microsoft.com/office/word/2020/wordml/sdtdatahash" xmlns:w16se="http://schemas.microsoft.com/office/word/2015/wordml/symex" xmlns:wpg="http://schemas.microsoft.com/office/word/2010/wordprocessingGroup" xmlns:wpi="http://schemas.microsoft.com/office/word/2010/wordprocessingInk" xmlns:wne="http://schemas.microsoft.com/office/word/2006/wordml" xmlns:wps="http://schemas.microsoft.com/office/word/2010/wordprocessingShape" mc:Ignorable="w14 w15 w16se w16cid w16 w16cex w16sdtdh wp14">
+<w:footnotes xmlns:wpc="http://schemas.microsoft.com/office/word/2010/wordprocessingCanvas" xmlns:cx="http://schemas.microsoft.com/office/drawing/2014/chartex" xmlns:cx1="http://schemas.microsoft.com/office/drawing/2015/9/8/chartex" xmlns:cx2="http://schemas.microsoft.com/office/drawing/2015/10/21/chartex" xmlns:cx3="http://schemas.microsoft.com/office/drawing/2016/5/9/chartex" xmlns:cx4="http://schemas.microsoft.com/office/drawing/2016/5/10/chartex" xmlns:cx5="http://schemas.microsoft.com/office/drawing/2016/5/11/chartex" xmlns:cx6="http://schemas.microsoft.com/office/drawing/2016/5/12/chartex" xmlns:cx7="http://schemas.microsoft.com/office/drawing/2016/5/13/chartex" xmlns:cx8="http://schemas.microsoft.com/office/drawing/2016/5/14/chartex" xmlns:mc="http://schemas.openxmlformats.org/markup-compatibility/2006" xmlns:aink="http://schemas.microsoft.com/office/drawing/2016/ink" xmlns:am3d="http://schemas.microsoft.com/office/drawing/2017/model3d" xmlns:o="urn:schemas-microsoft-com:office:office" xmlns:oel="http://schemas.microsoft.com/office/2019/extlst" xmlns:r="http://schemas.openxmlformats.org/officeDocument/2006/relationships" xmlns:m="http://schemas.openxmlformats.org/officeDocument/2006/math" xmlns:v="urn:schemas-microsoft-com:vml" xmlns:wp14="http://schemas.microsoft.com/office/word/2010/wordprocessingDrawing" xmlns:wp="http://schemas.openxmlformats.org/drawingml/2006/wordprocessingDrawing" xmlns:w10="urn:schemas-microsoft-com:office:word" xmlns:w="http://schemas.openxmlformats.org/wordprocessingml/2006/main" xmlns:w14="http://schemas.microsoft.com/office/word/2010/wordml" xmlns:w15="http://schemas.microsoft.com/office/word/2012/wordml" xmlns:w16cex="http://schemas.microsoft.com/office/word/2018/wordml/cex" xmlns:w16cid="http://schemas.microsoft.com/office/word/2016/wordml/cid" xmlns:w16="http://schemas.microsoft.com/office/word/2018/wordml" xmlns:w16sdtdh="http://schemas.microsoft.com/office/word/2020/wordml/sdtdatahash" xmlns:w16se="http://schemas.microsoft.com/office/word/2015/wordml/symex" xmlns:wpg="http://schemas.microsoft.com/office/word/2010/wordprocessingGroup" xmlns:wpi="http://schemas.microsoft.com/office/word/2010/wordprocessingInk" xmlns:wne="http://schemas.microsoft.com/office/word/2006/wordml" xmlns:wps="http://schemas.microsoft.com/office/word/2010/wordprocessingShape" mc:Ignorable="w14 w15 w16se w16cid w16 w16cex w16sdtdh wp14">
   <w:footnote w:type="separator" w:id="-1">
     <w:p>
       <w:r>
@@ -438,7 +438,7 @@
 </file>
 
 <file path=word/numbering.xml><?xml version="1.0" encoding="utf-8"?>
-<w:numbering xmlns:wpc="http://schemas.microsoft.com/office/word/2010/wordprocessingCanvas" xmlns:cx="http://schemas.microsoft.com/office/drawing/2014/chartex" xmlns:cx1="http://schemas.microsoft.com/office/drawing/2015/9/8/chartex" xmlns:cx2="http://schemas.microsoft.com/office/drawing/2015/10/21/chartex" xmlns:cx3="http://schemas.microsoft.com/office/drawing/2016/5/9/chartex" xmlns:cx4="http://schemas.microsoft.com/office/drawing/2016/5/10/chartex" xmlns:cx5="http://schemas.microsoft.com/office/drawing/2016/5/11/chartex" xmlns:cx6="http://schemas.microsoft.com/office/drawing/2016/5/12/chartex" xmlns:cx7="http://schemas.microsoft.com/office/drawing/2016/5/13/chartex" xmlns:cx8="http://schemas.microsoft.com/office/drawing/2016/5/14/chartex" xmlns:mc="http://schemas.openxmlformats.org/markup-compatibility/2006" xmlns:aink="http://schemas.microsoft.com/office/drawing/2016/ink" xmlns:am3d="http://schemas.microsoft.com/office/drawing/2017/model3d" xmlns:o="urn:schemas-microsoft-com:office:office" xmlns:r="http://schemas.openxmlformats.org/officeDocument/2006/relationships" xmlns:m="http://schemas.openxmlformats.org/officeDocument/2006/math" xmlns:v="urn:schemas-microsoft-com:vml" xmlns:wp14="http://schemas.microsoft.com/office/word/2010/wordprocessingDrawing" xmlns:wp="http://schemas.openxmlformats.org/drawingml/2006/wordprocessingDrawing" xmlns:w10="urn:schemas-microsoft-com:office:word" xmlns:w="http://schemas.openxmlformats.org/wordprocessingml/2006/main" xmlns:w14="http://schemas.microsoft.com/office/word/2010/wordml" xmlns:w15="http://schemas.microsoft.com/office/word/2012/wordml" xmlns:w16cex="http://schemas.microsoft.com/office/word/2018/wordml/cex" xmlns:w16cid="http://schemas.microsoft.com/office/word/2016/wordml/cid" xmlns:w16="http://schemas.microsoft.com/office/word/2018/wordml" xmlns:w16sdtdh="http://schemas.microsoft.com/office/word/2020/wordml/sdtdatahash" xmlns:w16se="http://schemas.microsoft.com/office/word/2015/wordml/symex" xmlns:wpg="http://schemas.microsoft.com/office/word/2010/wordprocessingGroup" xmlns:wpi="http://schemas.microsoft.com/office/word/2010/wordprocessingInk" xmlns:wne="http://schemas.microsoft.com/office/word/2006/wordml" xmlns:wps="http://schemas.microsoft.com/office/word/2010/wordprocessingShape" mc:Ignorable="w14 w15 w16se w16cid w16 w16cex w16sdtdh wp14">
+<w:numbering xmlns:wpc="http://schemas.microsoft.com/office/word/2010/wordprocessingCanvas" xmlns:cx="http://schemas.microsoft.com/office/drawing/2014/chartex" xmlns:cx1="http://schemas.microsoft.com/office/drawing/2015/9/8/chartex" xmlns:cx2="http://schemas.microsoft.com/office/drawing/2015/10/21/chartex" xmlns:cx3="http://schemas.microsoft.com/office/drawing/2016/5/9/chartex" xmlns:cx4="http://schemas.microsoft.com/office/drawing/2016/5/10/chartex" xmlns:cx5="http://schemas.microsoft.com/office/drawing/2016/5/11/chartex" xmlns:cx6="http://schemas.microsoft.com/office/drawing/2016/5/12/chartex" xmlns:cx7="http://schemas.microsoft.com/office/drawing/2016/5/13/chartex" xmlns:cx8="http://schemas.microsoft.com/office/drawing/2016/5/14/chartex" xmlns:mc="http://schemas.openxmlformats.org/markup-compatibility/2006" xmlns:aink="http://schemas.microsoft.com/office/drawing/2016/ink" xmlns:am3d="http://schemas.microsoft.com/office/drawing/2017/model3d" xmlns:o="urn:schemas-microsoft-com:office:office" xmlns:oel="http://schemas.microsoft.com/office/2019/extlst" xmlns:r="http://schemas.openxmlformats.org/officeDocument/2006/relationships" xmlns:m="http://schemas.openxmlformats.org/officeDocument/2006/math" xmlns:v="urn:schemas-microsoft-com:vml" xmlns:wp14="http://schemas.microsoft.com/office/word/2010/wordprocessingDrawing" xmlns:wp="http://schemas.openxmlformats.org/drawingml/2006/wordprocessingDrawing" xmlns:w10="urn:schemas-microsoft-com:office:word" xmlns:w="http://schemas.openxmlformats.org/wordprocessingml/2006/main" xmlns:w14="http://schemas.microsoft.com/office/word/2010/wordml" xmlns:w15="http://schemas.microsoft.com/office/word/2012/wordml" xmlns:w16cex="http://schemas.microsoft.com/office/word/2018/wordml/cex" xmlns:w16cid="http://schemas.microsoft.com/office/word/2016/wordml/cid" xmlns:w16="http://schemas.microsoft.com/office/word/2018/wordml" xmlns:w16sdtdh="http://schemas.microsoft.com/office/word/2020/wordml/sdtdatahash" xmlns:w16se="http://schemas.microsoft.com/office/word/2015/wordml/symex" xmlns:wpg="http://schemas.microsoft.com/office/word/2010/wordprocessingGroup" xmlns:wpi="http://schemas.microsoft.com/office/word/2010/wordprocessingInk" xmlns:wne="http://schemas.microsoft.com/office/word/2006/wordml" xmlns:wps="http://schemas.microsoft.com/office/word/2010/wordprocessingShape" mc:Ignorable="w14 w15 w16se w16cid w16 w16cex w16sdtdh wp14">
   <w:abstractNum w:abstractNumId="0" w15:restartNumberingAfterBreak="0">
     <w:nsid w:val="E17F69BA"/>
     <w:multiLevelType w:val="multilevel"/>
@@ -808,40 +808,40 @@
       <w:lvlJc w:val="left"/>
     </w:lvl>
   </w:abstractNum>
-  <w:num w:numId="1">
+  <w:num w:numId="1" w16cid:durableId="1013337440">
     <w:abstractNumId w:val="0"/>
   </w:num>
-  <w:num w:numId="2">
+  <w:num w:numId="2" w16cid:durableId="2035423517">
     <w:abstractNumId w:val="11"/>
   </w:num>
-  <w:num w:numId="3">
+  <w:num w:numId="3" w16cid:durableId="1586722645">
     <w:abstractNumId w:val="10"/>
   </w:num>
-  <w:num w:numId="4">
+  <w:num w:numId="4" w16cid:durableId="669214618">
     <w:abstractNumId w:val="8"/>
   </w:num>
-  <w:num w:numId="5">
+  <w:num w:numId="5" w16cid:durableId="245263615">
     <w:abstractNumId w:val="7"/>
   </w:num>
-  <w:num w:numId="6">
+  <w:num w:numId="6" w16cid:durableId="605578806">
     <w:abstractNumId w:val="6"/>
   </w:num>
-  <w:num w:numId="7">
+  <w:num w:numId="7" w16cid:durableId="797915559">
     <w:abstractNumId w:val="5"/>
   </w:num>
-  <w:num w:numId="8">
+  <w:num w:numId="8" w16cid:durableId="1148742489">
     <w:abstractNumId w:val="9"/>
   </w:num>
-  <w:num w:numId="9">
+  <w:num w:numId="9" w16cid:durableId="1156654602">
     <w:abstractNumId w:val="4"/>
   </w:num>
-  <w:num w:numId="10">
+  <w:num w:numId="10" w16cid:durableId="1298414777">
     <w:abstractNumId w:val="3"/>
   </w:num>
-  <w:num w:numId="11">
+  <w:num w:numId="11" w16cid:durableId="1084187519">
     <w:abstractNumId w:val="2"/>
   </w:num>
-  <w:num w:numId="12">
+  <w:num w:numId="12" w16cid:durableId="932930154">
     <w:abstractNumId w:val="1"/>
   </w:num>
 </w:numbering>
@@ -1513,11 +1513,12 @@
     <w:name w:val="caption"/>
     <w:basedOn w:val="Normal"/>
     <w:link w:val="CaptionChar"/>
+    <w:rsid w:val="00F2054D"/>
     <w:pPr>
       <w:spacing w:after="120"/>
     </w:pPr>
     <w:rPr>
-      <w:i/>
+      <w:rFonts w:ascii="Times New Roman" w:hAnsi="Times New Roman"/>
     </w:rPr>
   </w:style>
   <w:style w:type="paragraph" w:customStyle="1" w:styleId="TableCaption">
@@ -1551,6 +1552,10 @@
     <w:name w:val="Caption Char"/>
     <w:basedOn w:val="DefaultParagraphFont"/>
     <w:link w:val="Caption"/>
+    <w:rsid w:val="00F2054D"/>
+    <w:rPr>
+      <w:rFonts w:ascii="Times New Roman" w:hAnsi="Times New Roman"/>
+    </w:rPr>
   </w:style>
   <w:style w:type="character" w:customStyle="1" w:styleId="VerbatimChar">
     <w:name w:val="Verbatim Char"/>
@@ -1565,6 +1570,7 @@
     <w:name w:val="footnote reference"/>
     <w:basedOn w:val="CaptionChar"/>
     <w:rPr>
+      <w:rFonts w:ascii="Times New Roman" w:hAnsi="Times New Roman"/>
       <w:vertAlign w:val="superscript"/>
     </w:rPr>
   </w:style>
@@ -1572,6 +1578,7 @@
     <w:name w:val="Hyperlink"/>
     <w:basedOn w:val="CaptionChar"/>
     <w:rPr>
+      <w:rFonts w:ascii="Times New Roman" w:hAnsi="Times New Roman"/>
       <w:color w:val="4F81BD" w:themeColor="accent1"/>
     </w:rPr>
   </w:style>
@@ -1950,6 +1957,16 @@
       <w:rFonts w:ascii="Times New Roman" w:hAnsi="Times New Roman"/>
       <w:sz w:val="20"/>
     </w:rPr>
+  </w:style>
+  <w:style w:type="paragraph" w:styleId="TableofFigures">
+    <w:name w:val="table of figures"/>
+    <w:basedOn w:val="Normal"/>
+    <w:next w:val="Normal"/>
+    <w:unhideWhenUsed/>
+    <w:rsid w:val="000056B3"/>
+    <w:pPr>
+      <w:spacing w:after="0"/>
+    </w:pPr>
   </w:style>
 </w:styles>
 </file>

</xml_diff>